<commit_message>
test(docx): preserve whitespace in interoperability fixture
Mark the two boundary-space text runs with xml:space="preserve" so LibreOffice renders the synthetic source consistently with its editor roundtrip. Keep the strict text and pagination comparison unchanged.

Validation: DOCX interoperability passes with matching text and page count using local LibreOffice; all 10 CI DOCX state and roundtrip tests pass.
</commit_message>
<xml_diff>
--- a/apps/app/scripts/fixtures/legal-review.docx
+++ b/apps/app/scripts/fixtures/legal-review.docx
@@ -57,7 +57,7 @@
     <w:p>
       <w:commentRangeStart w:id="0"/>
       <w:r>
-        <w:t>Payment is due within </w:t>
+        <w:t xml:space="preserve">Payment is due within </w:t>
       </w:r>
       <w:del w:id="1" w:author="Counterparty" w:date="2026-09-05T09:00:00Z">
         <w:r>
@@ -70,7 +70,7 @@
         </w:r>
       </w:ins>
       <w:r>
-        <w:t> days of invoice.</w:t>
+        <w:t xml:space="preserve"> days of invoice.</w:t>
       </w:r>
       <w:commentRangeEnd w:id="0"/>
       <w:r>

</xml_diff>